<commit_message>
Update abstract with all team members
Co-Authored-By: Claude Sonnet 5.5 <noreply@anthropic.com>
</commit_message>
<xml_diff>
--- a/Project Abstract Document.docx
+++ b/Project Abstract Document.docx
@@ -569,6 +569,76 @@
                 <w:lang w:val="en-US"/>
               </w:rPr>
               <w:t>Y Sriram</w:t>
+            </w:r>
+          </w:p>
+        </w:tc>
+      </w:tr>
+      <w:tr>
+        <w:trPr>
+          <w:trHeight w:val="228" w:hRule="atLeast"/>
+          <w:jc w:val="center"/>
+        </w:trPr>
+        <w:tc>
+          <w:tcPr>
+            <w:tcW w:w="1448" w:type="dxa"/>
+          </w:tcPr>
+          <w:p>
+            <w:pPr>
+              <w:spacing w:after="0" w:line="240" w:lineRule="auto"/>
+              <w:jc w:val="center"/>
+              <w:rPr>
+                <w:rFonts w:ascii="Times New Roman" w:hAnsi="Times New Roman" w:cs="Times New Roman"/>
+              </w:rPr>
+            </w:pPr>
+            <w:r>
+              <w:rPr>
+                <w:rFonts w:ascii="Times New Roman" w:hAnsi="Times New Roman" w:cs="Times New Roman"/>
+              </w:rPr>
+              <w:t>4</w:t>
+            </w:r>
+          </w:p>
+        </w:tc>
+        <w:tc>
+          <w:tcPr>
+            <w:tcW w:w="2958" w:type="dxa"/>
+          </w:tcPr>
+          <w:p>
+            <w:pPr>
+              <w:spacing w:after="0" w:line="240" w:lineRule="auto"/>
+              <w:jc w:val="center"/>
+              <w:rPr>
+                <w:rFonts w:hint="default" w:ascii="Times New Roman" w:hAnsi="Times New Roman" w:cs="Times New Roman"/>
+                <w:lang w:val="en-US"/>
+              </w:rPr>
+            </w:pPr>
+            <w:r>
+              <w:rPr>
+                <w:rFonts w:hint="default" w:ascii="Times New Roman" w:hAnsi="Times New Roman" w:cs="Times New Roman"/>
+                <w:lang w:val="en-US"/>
+              </w:rPr>
+              <w:t>2400032486</w:t>
+            </w:r>
+          </w:p>
+        </w:tc>
+        <w:tc>
+          <w:tcPr>
+            <w:tcW w:w="5493" w:type="dxa"/>
+          </w:tcPr>
+          <w:p>
+            <w:pPr>
+              <w:spacing w:after="0" w:line="240" w:lineRule="auto"/>
+              <w:jc w:val="center"/>
+              <w:rPr>
+                <w:rFonts w:hint="default" w:ascii="Times New Roman" w:hAnsi="Times New Roman" w:cs="Times New Roman"/>
+                <w:lang w:val="en-US"/>
+              </w:rPr>
+            </w:pPr>
+            <w:r>
+              <w:rPr>
+                <w:rFonts w:hint="default" w:ascii="Times New Roman" w:hAnsi="Times New Roman" w:cs="Times New Roman"/>
+                <w:lang w:val="en-US"/>
+              </w:rPr>
+              <w:t>R Sai Sidhartha</w:t>
             </w:r>
           </w:p>
         </w:tc>

</xml_diff>

<commit_message>
Rename project to College Canteen Pre-Ordering App in Project Abstract Document.docx
Co-Authored-By: Claude Sonnet 5.5 <noreply@anthropic.com>
</commit_message>
<xml_diff>
--- a/Project Abstract Document.docx
+++ b/Project Abstract Document.docx
@@ -269,7 +269,7 @@
                 <w:b/>
                 <w:bCs/>
               </w:rPr>
-              <w:t>Food and Delivery: Campus Food Pre-Ordering</w:t>
+              <w:t>College Canteen Pre-Ordering App</w:t>
             </w:r>
           </w:p>
           <w:p>
@@ -752,7 +752,7 @@
         <w:rPr>
           <w:rFonts w:ascii="Times New Roman" w:hAnsi="Times New Roman" w:cs="Times New Roman"/>
         </w:rPr>
-        <w:t xml:space="preserve"> Students queue for ten to twenty minutes just to place an order, kitchens receive orders unevenly through the day, and prepared food is frequently left uncollected, wasting both time and food. Cash-heavy, walk-up ordering also makes it hard for canteen staff to plan preparation in advance or track demand across menu items. These pain points motivate the Campus Food Pre-Ordering platform, a web application that lets students browse live menus, place and pay for orders in advance, and collect food at a scheduled slot with little to no wait.</w:t>
+        <w:t xml:space="preserve"> Students queue for ten to twenty minutes just to place an order, kitchens receive orders unevenly through the day, and prepared food is frequently left uncollected, wasting both time and food. Cash-heavy, walk-up ordering also makes it hard for canteen staff to plan preparation in advance or track demand across menu items. These pain points motivate the College Canteen Pre-Ordering App, a web application that lets students browse live menus, place and pay for orders in advance, and collect food at a scheduled slot with little to no wait.</w:t>
       </w:r>
     </w:p>
     <w:p>

</xml_diff>